<commit_message>
Strengthen risk report with date audit and review economics
</commit_message>
<xml_diff>
--- a/fintechathon-topic3/report/报告可编辑稿.docx
+++ b/fintechathon-topic3/report/报告可编辑稿.docx
@@ -36,7 +36,7 @@
           <w:b/>
           <w:sz w:val="40"/>
         </w:rPr>
-        <w:t>基于公开口碑信息的餐饮商户经营风险画像及验证</w:t>
+        <w:t>从公开口碑到复核决策：餐饮商户经营风险指标构建与验证</w:t>
       </w:r>
     </w:p>
     <w:p>
@@ -45,7 +45,7 @@
         <w:jc w:val="center"/>
       </w:pPr>
       <w:r>
-        <w:t>——营业状态识别的可行性研究</w:t>
+        <w:t>——可解释画像、预算验证与日期偏差审计</w:t>
       </w:r>
     </w:p>
     <w:p/>
@@ -78,7 +78,7 @@
         <w:jc w:val="both"/>
       </w:pPr>
       <w:r>
-        <w:t>针对小微餐饮主体财务信息稀缺的问题，本文研究公开口碑信息能否补充经营风险画像。基于某生活服务平台的海外历史区域子集，筛选674家餐饮商户，其中123家记录为停止营业；围绕口碑质量、评论活跃度和低分评论主题构建12项指标，比较逻辑回归与梯度提升树的六种输入组合，并进行独立测试和人工复核预算模拟。按验证集确定的增强逻辑回归，测试ROC-AUC为0.577、平均精确率AP为0.220；相对评分质量基线的AP增量为0.009，95%配对Bootstrap区间包含0。预设增强树模型AP为0.319，在复核14家测试商户时命中7家停止营业商户，相对随机名单的点估计提升2.70倍，但区间仍包含无提升的可能。公开信息可形成低成本调查线索，尚未证明稳定的风险识别增益。由于缺少关闭日期、真实流水和信用表现，结果仅支持历史营业状态识别，不能解释为提前停业预测或信用违约预测。</w:t>
+        <w:t>针对小微餐饮主体财务信息稀缺的问题，本文研究公开口碑信息能否补充经营风险画像。基于某生活服务平台的海外历史区域子集，筛选674家餐饮商户，其中123家记录为停止营业；围绕口碑质量、评论活跃度和低分评论主题构建12项指标，比较逻辑回归与梯度提升树的六种输入组合，并进行独立测试和人工复核预算模拟。按验证集确定的增强逻辑回归，测试ROC-AUC为0.577、平均精确率AP为0.220；相对评分质量基线的AP增量为0.009，95%配对Bootstrap区间包含0。预设增强树模型AP为0.319，在复核14家测试商户时命中7家停止营业商户，相对随机名单的点估计提升2.70倍，但区间仍包含无提升的可能。补充同年份配对审计后，增强树模型AUC由0.631降至0.488，提示总体优势可能受年代结构影响。本文形成“画像—复核—反馈”的产品闭环与收益检验条件；结果支持调查线索构建，尚未证明前瞻经营或信用风险识别增益。</w:t>
       </w:r>
     </w:p>
     <w:p>
@@ -110,7 +110,7 @@
         <w:jc w:val="both"/>
       </w:pPr>
       <w:r>
-        <w:t>本文提出三个问题：第一，能否将公开评论转化为可解释的经营画像指标？第二，相较于只看评分质量，评论活跃度和低分主题是否提供增量识别价值？第三，在人工核查预算有限时，模型排序是否比随机抽查或低评分筛选更有效？研究以餐饮业为代表，以公开营业状态作为可得的替代验证标签。</w:t>
+        <w:t>研究依次回答“信息能否量化、量化是否有效、有效是否值得使用”：构建口碑、活跃度及主题指标；相对评分基线检验增量；在固定核查预算下验证排序价值。贡献在于将指标构建、保留测试、预算验证和日期偏差审计串联，形成可复验的决策证据链。研究以餐饮商户为代理，以公开营业状态作替代验证标签。</w:t>
       </w:r>
     </w:p>
     <w:p>
@@ -787,7 +787,7 @@
         <w:jc w:val="both"/>
       </w:pPr>
       <w:r>
-        <w:t>停止营业商户近360天均分为3.43，营业商户为3.66；近期评分变化均值分别为-0.265与0.002。近期评论数均值分别为7.63与11.21，但两组中位数均为7，说明分布偏态。价格主题占比在停业组较高，卫生主题则未呈现预期方向。组间差异以Mann–Whitney检验并作12项Holm校正，仅作探索性描述，不用于因果推断。</w:t>
+        <w:t>停止营业商户近360天均分为3.43，营业商户为3.66；近期评分变化均值分别为-0.265与0.002。近期评论数均值分别为7.63与11.21，但两组中位数均为7，说明分布偏态。12项Mann–Whitney检验作Holm校正后，仅均分和价格主题在0.05水平有差异（校正p=0.0065、0.0487）；评分变化p=0.0538，卫生主题未呈预期方向。描述差异不等于独立预测价值，主题提及也不代表因果关系。</w:t>
       </w:r>
     </w:p>
     <w:p>
@@ -2471,7 +2471,7 @@
         <w:jc w:val="both"/>
       </w:pPr>
       <w:r>
-        <w:t>营业与停止营业组的最后评论年份存在明显差异：551家营业商户中528家最后评论在2017年，123家停止营业商户中只有6家在2017年。图5展示这一结构及固定主模型的子样本敏感性结果。日期没有作为模型输入，但窗口年代差异仍可能影响评论量与消费行为。</w:t>
+        <w:t>营业与停止营业组的最后评论年份存在明显差异：551家营业商户中528家最后评论在2017年，123家停止营业商户中只有6家在2017年。图5展示这一结构与固定预测的追加日期审计。虽未输入年份，窗口年代仍可能影响评论量和消费行为；排除直接日期变量不能保证已消除混杂。</w:t>
       </w:r>
     </w:p>
     <w:p>
@@ -2482,7 +2482,7 @@
       <w:r>
         <w:drawing>
           <wp:inline xmlns:a="http://schemas.openxmlformats.org/drawingml/2006/main" xmlns:pic="http://schemas.openxmlformats.org/drawingml/2006/picture">
-            <wp:extent cx="5832000" cy="1681686"/>
+            <wp:extent cx="5832000" cy="1693424"/>
             <wp:docPr id="5" name="Picture 5"/>
             <wp:cNvGraphicFramePr>
               <a:graphicFrameLocks noChangeAspect="1"/>
@@ -2503,7 +2503,7 @@
                   <pic:spPr>
                     <a:xfrm>
                       <a:off x="0" y="0"/>
-                      <a:ext cx="5832000" cy="1681686"/>
+                      <a:ext cx="5832000" cy="1693424"/>
                     </a:xfrm>
                     <a:prstGeom prst="rect"/>
                   </pic:spPr>
@@ -2521,7 +2521,7 @@
         <w:jc w:val="center"/>
       </w:pPr>
       <w:r>
-        <w:t>图5 日期结构差异及固定主模型的子样本敏感性核对</w:t>
+        <w:t>图5 日期结构及追加同年份审计（事后诊断，未重新拟合）</w:t>
       </w:r>
     </w:p>
     <w:p>
@@ -2529,7 +2529,7 @@
         <w:jc w:val="both"/>
       </w:pPr>
       <w:r>
-        <w:t>将测试样本限定为最后评论年份2015年及之后时，125家商户中15家标记停业，主模型ROC-AUC为0.525、AP为0.141，接近随机表现。至少20条总评论的114家子样本ROC-AUC为0.558。上述核对只筛选原测试预测，没有为提高分数重新调参；未证明主分析增益稳定。</w:t>
+        <w:t>只比较同一年内停业—营业配对，共260对，主模型AUC为0.673，增强树为0.488；仅2017年107家（停业2家）时分别为0.738、0.481。树模型总体优势未在日期限制下保留，主模型较高子组分数也因事件极少而不稳定。该审计在原结果之后设计，未调参，不能作为确认性证据。原2015年及之后子样本主模型AUC仅0.525，仍需独立复验。</w:t>
       </w:r>
     </w:p>
     <w:p>
@@ -2574,7 +2574,7 @@
         <w:jc w:val="both"/>
       </w:pPr>
       <w:r>
-        <w:t>建议将产品定位为“小微商户经营线索助手”：把公开信息转化为调查优先级、触发原因和数据可信度，服务贷前信息补充与贷后人工核查。现阶段不输出“违约概率”，也不以平台评分直接决定拒贷。公开数据模块应与真实流水模块并列，保留各自的信息来源和不确定性。</w:t>
+        <w:t>产品定位为“小微商户经营线索助手”，向银行客户经理输出“调查优先级＋触发指标＋可信度”。无足够评论时显示信息不足；有线索时核实经营和实际流水。画像可上线为信息展示，模型排序暂不进入自动授信。指标异常仅作核查理由，不当作真实经营问题的确证。</w:t>
       </w:r>
     </w:p>
     <w:p>
@@ -2584,7 +2584,7 @@
         <w:jc w:val="center"/>
       </w:pPr>
       <w:r>
-        <w:t>表6 产品模块、输出与业务动作</w:t>
+        <w:t>表6 产品闭环：从线索到可验证行动</w:t>
       </w:r>
     </w:p>
     <w:tbl>
@@ -2884,7 +2884,7 @@
         <w:jc w:val="both"/>
       </w:pPr>
       <w:r>
-        <w:t>业务落地分三步。第一步先核实经营主体规模、统一观测时间和数据使用范围；第二步在真实流水基线上增加公开指标，采用时间外及地区外测试，比较增量和复核效率；第三步以实际核查成本、风险损失和干预结果评价收益，而不是只看AUC。预算比例由业务能力确定，不能用本次测试反复挑选最有利的阈值。</w:t>
+        <w:t>商业评价以每期复核k家为单位：净价值=k×(p×v-c)-F，其中p为前瞻验证的可行动风险命中率，v为每次有效发现的净收益，c为单家核查成本，F为期间固定成本。相对同预算低评分名单，增量价值=(命中差)×v-新增固定成本。本次主模型命中差为0，树模型为4，但停业命中不能代替可行动风险，不能据此估算节省金额。</w:t>
       </w:r>
     </w:p>
     <w:p>
@@ -2908,7 +2908,7 @@
         <w:jc w:val="both"/>
       </w:pPr>
       <w:r>
-        <w:t>公开数据的合理价值，是让授信调查更有针对性，并以可验证的方式补充真实经营信息。下一阶段应优先取得统一时点的真实流水与未来经营/信用标签，完成独立复验后再评估商业部署。本文同时报告积极线索与不确定性，避免将替代标签、单次高分或历史状态痕迹误当成信用风险预测能力。</w:t>
+        <w:t>下一阶段采用统一月末观察点和之后90天经营核实标签；真实逾期单独验证。预先锁定流水基线、流水＋公开指标、10%复核预算及成本口径，保留后续月份与新地区测试。试点保留随机抽查组，复核人员先独立确认再查看模型原因。仅在增量置信区间下界&gt;0且净价值&gt;0时扩大使用，否则维持画像展示和人工调查。此为待执行方案，不是已完成实验。</w:t>
       </w:r>
     </w:p>
     <w:p>

</xml_diff>

<commit_message>
Complete evidence-to-decision report and prospective validation loop
</commit_message>
<xml_diff>
--- a/fintechathon-topic3/report/报告可编辑稿.docx
+++ b/fintechathon-topic3/report/报告可编辑稿.docx
@@ -158,7 +158,7 @@
       <w:r>
         <w:drawing>
           <wp:inline xmlns:a="http://schemas.openxmlformats.org/drawingml/2006/main" xmlns:pic="http://schemas.openxmlformats.org/drawingml/2006/picture">
-            <wp:extent cx="5832000" cy="2050722"/>
+            <wp:extent cx="5832000" cy="2053482"/>
             <wp:docPr id="1" name="Picture 1"/>
             <wp:cNvGraphicFramePr>
               <a:graphicFrameLocks noChangeAspect="1"/>
@@ -179,7 +179,7 @@
                   <pic:spPr>
                     <a:xfrm>
                       <a:off x="0" y="0"/>
-                      <a:ext cx="5832000" cy="2050722"/>
+                      <a:ext cx="5832000" cy="2053482"/>
                     </a:xfrm>
                     <a:prstGeom prst="rect"/>
                   </pic:spPr>
@@ -197,7 +197,7 @@
         <w:jc w:val="center"/>
       </w:pPr>
       <w:r>
-        <w:t>图1 样本逐步筛选及最终营业状态分布</w:t>
+        <w:t>图1 样本筛选及纳入／排除商户的营业状态</w:t>
       </w:r>
     </w:p>
     <w:p>
@@ -454,7 +454,7 @@
         <w:jc w:val="both"/>
       </w:pPr>
       <w:r>
-        <w:t>最终样本包含核心城区商户635家、邻近城区39家。筛选排除了新店、评价较少及长期无评论的商户，改善指标可观测性，也形成样本选择偏差。全部报告图表均为匿名聚合结果，不展示商户名称、评论者信息或原始评论。</w:t>
+        <w:t>样本含核心城区635家、邻近城区39家，覆盖原餐饮商户49.52%，只覆盖原停业商户38.68%。未纳入的687家中195家停业，占28.38%，高于纳入组18.25%。门槛提高可观测性，却排除较多停业主体；信息不足应进入补资料流程，不能标为低风险。图表仅展示匿名聚合结果。</w:t>
       </w:r>
     </w:p>
     <w:p>
@@ -475,7 +475,7 @@
         <w:jc w:val="both"/>
       </w:pPr>
       <w:r>
-        <w:t>以各商户最后一条评论日期作为历史窗口锚点：近360天为距锚点0—359天，近期与前期分别为0—179天和180—359天。窗口在不同商户之间不对应统一日历时间，因而本设计属于历史横截面比较。基于经营机制构建三类、共12项指标，见表2。</w:t>
+        <w:t>以各商户最后一条评论日期作为历史窗口锚点：近360天为距锚点0—359天，近期与前期分别为0—179天和180—359天。窗口不对应统一日历时间，本设计属于历史横截面比较。机制假设是：体验恶化可能伴随需求流失，关注度波动可能提示经营不稳定，低分主题提供核查方向；评论不是现金流。按三类构建12项指标（表2），预期方向仅作研究假设，不硬编码为风险加分。</w:t>
       </w:r>
     </w:p>
     <w:p>
@@ -729,7 +729,7 @@
         <w:jc w:val="both"/>
       </w:pPr>
       <w:r>
-        <w:t>数量变化定义为log(1+近期数量)-log(1+前期数量)。低分指评分不超过2分；各主题以固定词典匹配，分母为近期全部评论数。40家商户前期窗口无评论，其均分变化记为缺失，在拟合数据上作中位数填补并增加缺失指示。评论数不是客流或营业额，词典主题也未经独立人工标注验证。</w:t>
+        <w:t>数量变化定义为log(1+近期数量)-log(1+前期数量)。低分指评分不超过2分；各主题以固定词典匹配，分母为近期全部评论数。40家商户前期窗口无评论，其均分变化记为缺失，在拟合数据上作中位数填补并增加缺失指示。低分主题只是词语提及，并非经人工确认的投诉。拟合样本均分与低分占比Spearman相关为-0.934，近期与前期评论数为0.736；相关指标的回归符号不能单独解释为风险方向或因果效应。</w:t>
       </w:r>
     </w:p>
     <w:p>
@@ -1250,15 +1250,16 @@
         <w:tblLook w:firstColumn="1" w:firstRow="1" w:lastColumn="0" w:lastRow="0" w:noHBand="0" w:noVBand="1" w:val="04A0"/>
       </w:tblPr>
       <w:tblGrid>
-        <w:gridCol w:w="2296"/>
-        <w:gridCol w:w="2296"/>
-        <w:gridCol w:w="2296"/>
-        <w:gridCol w:w="2296"/>
+        <w:gridCol w:w="1837"/>
+        <w:gridCol w:w="1837"/>
+        <w:gridCol w:w="1837"/>
+        <w:gridCol w:w="1837"/>
+        <w:gridCol w:w="1837"/>
       </w:tblGrid>
       <w:tr>
         <w:tc>
           <w:tcPr>
-            <w:tcW w:type="dxa" w:w="2296"/>
+            <w:tcW w:type="dxa" w:w="1837"/>
           </w:tcPr>
           <w:p>
             <w:pPr>
@@ -1276,7 +1277,7 @@
         </w:tc>
         <w:tc>
           <w:tcPr>
-            <w:tcW w:type="dxa" w:w="2296"/>
+            <w:tcW w:type="dxa" w:w="1837"/>
           </w:tcPr>
           <w:p>
             <w:pPr>
@@ -1294,7 +1295,7 @@
         </w:tc>
         <w:tc>
           <w:tcPr>
-            <w:tcW w:type="dxa" w:w="2296"/>
+            <w:tcW w:type="dxa" w:w="1837"/>
           </w:tcPr>
           <w:p>
             <w:pPr>
@@ -1312,7 +1313,7 @@
         </w:tc>
         <w:tc>
           <w:tcPr>
-            <w:tcW w:type="dxa" w:w="2296"/>
+            <w:tcW w:type="dxa" w:w="1837"/>
           </w:tcPr>
           <w:p>
             <w:pPr>
@@ -1328,11 +1329,29 @@
             </w:r>
           </w:p>
         </w:tc>
+        <w:tc>
+          <w:tcPr>
+            <w:tcW w:type="dxa" w:w="1837"/>
+          </w:tcPr>
+          <w:p>
+            <w:pPr>
+              <w:spacing w:line="360" w:lineRule="auto"/>
+              <w:ind w:firstLine="0"/>
+            </w:pPr>
+            <w:r>
+              <w:rPr>
+                <w:b/>
+                <w:sz w:val="21"/>
+              </w:rPr>
+              <w:t>Brier↓</w:t>
+            </w:r>
+          </w:p>
+        </w:tc>
       </w:tr>
       <w:tr>
         <w:tc>
           <w:tcPr>
-            <w:tcW w:type="dxa" w:w="2296"/>
+            <w:tcW w:type="dxa" w:w="1837"/>
           </w:tcPr>
           <w:p>
             <w:pPr>
@@ -1350,7 +1369,7 @@
         </w:tc>
         <w:tc>
           <w:tcPr>
-            <w:tcW w:type="dxa" w:w="2296"/>
+            <w:tcW w:type="dxa" w:w="1837"/>
           </w:tcPr>
           <w:p>
             <w:pPr>
@@ -1368,7 +1387,7 @@
         </w:tc>
         <w:tc>
           <w:tcPr>
-            <w:tcW w:type="dxa" w:w="2296"/>
+            <w:tcW w:type="dxa" w:w="1837"/>
           </w:tcPr>
           <w:p>
             <w:pPr>
@@ -1386,7 +1405,7 @@
         </w:tc>
         <w:tc>
           <w:tcPr>
-            <w:tcW w:type="dxa" w:w="2296"/>
+            <w:tcW w:type="dxa" w:w="1837"/>
           </w:tcPr>
           <w:p>
             <w:pPr>
@@ -1402,11 +1421,29 @@
             </w:r>
           </w:p>
         </w:tc>
+        <w:tc>
+          <w:tcPr>
+            <w:tcW w:type="dxa" w:w="1837"/>
+          </w:tcPr>
+          <w:p>
+            <w:pPr>
+              <w:spacing w:line="360" w:lineRule="auto"/>
+              <w:ind w:firstLine="0"/>
+            </w:pPr>
+            <w:r>
+              <w:rPr>
+                <w:b w:val="0"/>
+                <w:sz w:val="21"/>
+              </w:rPr>
+              <w:t>0.1635</w:t>
+            </w:r>
+          </w:p>
+        </w:tc>
       </w:tr>
       <w:tr>
         <w:tc>
           <w:tcPr>
-            <w:tcW w:type="dxa" w:w="2296"/>
+            <w:tcW w:type="dxa" w:w="1837"/>
           </w:tcPr>
           <w:p>
             <w:pPr>
@@ -1424,7 +1461,7 @@
         </w:tc>
         <w:tc>
           <w:tcPr>
-            <w:tcW w:type="dxa" w:w="2296"/>
+            <w:tcW w:type="dxa" w:w="1837"/>
           </w:tcPr>
           <w:p>
             <w:pPr>
@@ -1442,7 +1479,7 @@
         </w:tc>
         <w:tc>
           <w:tcPr>
-            <w:tcW w:type="dxa" w:w="2296"/>
+            <w:tcW w:type="dxa" w:w="1837"/>
           </w:tcPr>
           <w:p>
             <w:pPr>
@@ -1460,7 +1497,7 @@
         </w:tc>
         <w:tc>
           <w:tcPr>
-            <w:tcW w:type="dxa" w:w="2296"/>
+            <w:tcW w:type="dxa" w:w="1837"/>
           </w:tcPr>
           <w:p>
             <w:pPr>
@@ -1476,11 +1513,29 @@
             </w:r>
           </w:p>
         </w:tc>
+        <w:tc>
+          <w:tcPr>
+            <w:tcW w:type="dxa" w:w="1837"/>
+          </w:tcPr>
+          <w:p>
+            <w:pPr>
+              <w:spacing w:line="360" w:lineRule="auto"/>
+              <w:ind w:firstLine="0"/>
+            </w:pPr>
+            <w:r>
+              <w:rPr>
+                <w:b w:val="0"/>
+                <w:sz w:val="21"/>
+              </w:rPr>
+              <w:t>0.1681</w:t>
+            </w:r>
+          </w:p>
+        </w:tc>
       </w:tr>
       <w:tr>
         <w:tc>
           <w:tcPr>
-            <w:tcW w:type="dxa" w:w="2296"/>
+            <w:tcW w:type="dxa" w:w="1837"/>
           </w:tcPr>
           <w:p>
             <w:pPr>
@@ -1498,7 +1553,7 @@
         </w:tc>
         <w:tc>
           <w:tcPr>
-            <w:tcW w:type="dxa" w:w="2296"/>
+            <w:tcW w:type="dxa" w:w="1837"/>
           </w:tcPr>
           <w:p>
             <w:pPr>
@@ -1516,7 +1571,7 @@
         </w:tc>
         <w:tc>
           <w:tcPr>
-            <w:tcW w:type="dxa" w:w="2296"/>
+            <w:tcW w:type="dxa" w:w="1837"/>
           </w:tcPr>
           <w:p>
             <w:pPr>
@@ -1534,7 +1589,7 @@
         </w:tc>
         <w:tc>
           <w:tcPr>
-            <w:tcW w:type="dxa" w:w="2296"/>
+            <w:tcW w:type="dxa" w:w="1837"/>
           </w:tcPr>
           <w:p>
             <w:pPr>
@@ -1550,11 +1605,29 @@
             </w:r>
           </w:p>
         </w:tc>
+        <w:tc>
+          <w:tcPr>
+            <w:tcW w:type="dxa" w:w="1837"/>
+          </w:tcPr>
+          <w:p>
+            <w:pPr>
+              <w:spacing w:line="360" w:lineRule="auto"/>
+              <w:ind w:firstLine="0"/>
+            </w:pPr>
+            <w:r>
+              <w:rPr>
+                <w:b w:val="0"/>
+                <w:sz w:val="21"/>
+              </w:rPr>
+              <w:t>0.1663</w:t>
+            </w:r>
+          </w:p>
+        </w:tc>
       </w:tr>
       <w:tr>
         <w:tc>
           <w:tcPr>
-            <w:tcW w:type="dxa" w:w="2296"/>
+            <w:tcW w:type="dxa" w:w="1837"/>
           </w:tcPr>
           <w:p>
             <w:pPr>
@@ -1572,7 +1645,7 @@
         </w:tc>
         <w:tc>
           <w:tcPr>
-            <w:tcW w:type="dxa" w:w="2296"/>
+            <w:tcW w:type="dxa" w:w="1837"/>
           </w:tcPr>
           <w:p>
             <w:pPr>
@@ -1590,7 +1663,7 @@
         </w:tc>
         <w:tc>
           <w:tcPr>
-            <w:tcW w:type="dxa" w:w="2296"/>
+            <w:tcW w:type="dxa" w:w="1837"/>
           </w:tcPr>
           <w:p>
             <w:pPr>
@@ -1608,7 +1681,7 @@
         </w:tc>
         <w:tc>
           <w:tcPr>
-            <w:tcW w:type="dxa" w:w="2296"/>
+            <w:tcW w:type="dxa" w:w="1837"/>
           </w:tcPr>
           <w:p>
             <w:pPr>
@@ -1624,11 +1697,29 @@
             </w:r>
           </w:p>
         </w:tc>
+        <w:tc>
+          <w:tcPr>
+            <w:tcW w:type="dxa" w:w="1837"/>
+          </w:tcPr>
+          <w:p>
+            <w:pPr>
+              <w:spacing w:line="360" w:lineRule="auto"/>
+              <w:ind w:firstLine="0"/>
+            </w:pPr>
+            <w:r>
+              <w:rPr>
+                <w:b w:val="0"/>
+                <w:sz w:val="21"/>
+              </w:rPr>
+              <w:t>0.1590</w:t>
+            </w:r>
+          </w:p>
+        </w:tc>
       </w:tr>
       <w:tr>
         <w:tc>
           <w:tcPr>
-            <w:tcW w:type="dxa" w:w="2296"/>
+            <w:tcW w:type="dxa" w:w="1837"/>
           </w:tcPr>
           <w:p>
             <w:pPr>
@@ -1646,7 +1737,7 @@
         </w:tc>
         <w:tc>
           <w:tcPr>
-            <w:tcW w:type="dxa" w:w="2296"/>
+            <w:tcW w:type="dxa" w:w="1837"/>
           </w:tcPr>
           <w:p>
             <w:pPr>
@@ -1664,7 +1755,7 @@
         </w:tc>
         <w:tc>
           <w:tcPr>
-            <w:tcW w:type="dxa" w:w="2296"/>
+            <w:tcW w:type="dxa" w:w="1837"/>
           </w:tcPr>
           <w:p>
             <w:pPr>
@@ -1682,7 +1773,7 @@
         </w:tc>
         <w:tc>
           <w:tcPr>
-            <w:tcW w:type="dxa" w:w="2296"/>
+            <w:tcW w:type="dxa" w:w="1837"/>
           </w:tcPr>
           <w:p>
             <w:pPr>
@@ -1698,11 +1789,29 @@
             </w:r>
           </w:p>
         </w:tc>
+        <w:tc>
+          <w:tcPr>
+            <w:tcW w:type="dxa" w:w="1837"/>
+          </w:tcPr>
+          <w:p>
+            <w:pPr>
+              <w:spacing w:line="360" w:lineRule="auto"/>
+              <w:ind w:firstLine="0"/>
+            </w:pPr>
+            <w:r>
+              <w:rPr>
+                <w:b w:val="0"/>
+                <w:sz w:val="21"/>
+              </w:rPr>
+              <w:t>0.1593</w:t>
+            </w:r>
+          </w:p>
+        </w:tc>
       </w:tr>
       <w:tr>
         <w:tc>
           <w:tcPr>
-            <w:tcW w:type="dxa" w:w="2296"/>
+            <w:tcW w:type="dxa" w:w="1837"/>
           </w:tcPr>
           <w:p>
             <w:pPr>
@@ -1720,7 +1829,7 @@
         </w:tc>
         <w:tc>
           <w:tcPr>
-            <w:tcW w:type="dxa" w:w="2296"/>
+            <w:tcW w:type="dxa" w:w="1837"/>
           </w:tcPr>
           <w:p>
             <w:pPr>
@@ -1738,7 +1847,7 @@
         </w:tc>
         <w:tc>
           <w:tcPr>
-            <w:tcW w:type="dxa" w:w="2296"/>
+            <w:tcW w:type="dxa" w:w="1837"/>
           </w:tcPr>
           <w:p>
             <w:pPr>
@@ -1756,7 +1865,7 @@
         </w:tc>
         <w:tc>
           <w:tcPr>
-            <w:tcW w:type="dxa" w:w="2296"/>
+            <w:tcW w:type="dxa" w:w="1837"/>
           </w:tcPr>
           <w:p>
             <w:pPr>
@@ -1769,6 +1878,24 @@
                 <w:sz w:val="21"/>
               </w:rPr>
               <w:t>0.319</w:t>
+            </w:r>
+          </w:p>
+        </w:tc>
+        <w:tc>
+          <w:tcPr>
+            <w:tcW w:type="dxa" w:w="1837"/>
+          </w:tcPr>
+          <w:p>
+            <w:pPr>
+              <w:spacing w:line="360" w:lineRule="auto"/>
+              <w:ind w:firstLine="0"/>
+            </w:pPr>
+            <w:r>
+              <w:rPr>
+                <w:b w:val="0"/>
+                <w:sz w:val="21"/>
+              </w:rPr>
+              <w:t>0.1519</w:t>
             </w:r>
           </w:p>
         </w:tc>
@@ -1787,7 +1914,7 @@
         <w:jc w:val="both"/>
       </w:pPr>
       <w:r>
-        <w:t>本次测试仅含25家停止营业商户，区间较宽；多模型比较未作家族显著性校正，结果应按探索性证据理解。模型输出仅表示历史样本的状态排序，不视为校准的未来停业概率或贷款违约概率，也不据测试最高分直接决定部署方案。</w:t>
+        <w:t>Brier为预测概率与标签的均方误差，越低越好。只用拟合期停业比例18.18%作常数预测，测试Brier为0.1509，主模型0.1663、增强树0.1519，均未优于此概率评分基线。因此分数仅作历史排序，不展示为风险概率。测试只有25家停业，多模型比较未校正，均按探索性证据理解。</w:t>
       </w:r>
     </w:p>
     <w:p>
@@ -2545,7 +2672,7 @@
         <w:jc w:val="both"/>
       </w:pPr>
       <w:r>
-        <w:t>样本边界：平台消费者并非全部客群，评价数不等于营业额。新店、低评价量和长期无评论主体被排除；企业规模、连锁关系和评论真实性尚未核验。词典主题只反映低分评论中的话题提及，不是精确投诉归因。</w:t>
+        <w:t>样本边界：平台消费者并非全部客群，评价数不等于营业额。历史跨度不足或锚点前半年评论较少的主体被排除；企业规模、连锁关系和评论真实性尚未核验。词典主题只反映低分评论中的话题提及，不是精确投诉归因。</w:t>
       </w:r>
     </w:p>
     <w:p>
@@ -2584,7 +2711,7 @@
         <w:jc w:val="center"/>
       </w:pPr>
       <w:r>
-        <w:t>表6 产品闭环：从线索到可验证行动</w:t>
+        <w:t>表6 产品闭环：证据、动作与反馈</w:t>
       </w:r>
     </w:p>
     <w:tbl>
@@ -2613,7 +2740,7 @@
                 <w:b/>
                 <w:sz w:val="21"/>
               </w:rPr>
-              <w:t>模块</w:t>
+              <w:t>环节</w:t>
             </w:r>
           </w:p>
         </w:tc>
@@ -2631,7 +2758,7 @@
                 <w:b/>
                 <w:sz w:val="21"/>
               </w:rPr>
-              <w:t>输出</w:t>
+              <w:t>当前证据／输出</w:t>
             </w:r>
           </w:p>
         </w:tc>
@@ -2649,7 +2776,7 @@
                 <w:b/>
                 <w:sz w:val="21"/>
               </w:rPr>
-              <w:t>建议动作</w:t>
+              <w:t>业务动作与回流</w:t>
             </w:r>
           </w:p>
         </w:tc>
@@ -2669,7 +2796,7 @@
                 <w:b w:val="0"/>
                 <w:sz w:val="21"/>
               </w:rPr>
-              <w:t>数据可用性</w:t>
+              <w:t>可观测性</w:t>
             </w:r>
           </w:p>
         </w:tc>
@@ -2687,7 +2814,7 @@
                 <w:b w:val="0"/>
                 <w:sz w:val="21"/>
               </w:rPr>
-              <w:t>评论数量、覆盖跨度、更新情况</w:t>
+              <w:t>样本覆盖49.52%；更新日未知</w:t>
             </w:r>
           </w:p>
         </w:tc>
@@ -2705,7 +2832,7 @@
                 <w:b w:val="0"/>
                 <w:sz w:val="21"/>
               </w:rPr>
-              <w:t>不足时提示“信息不足”，补充资料</w:t>
+              <w:t>未覆盖商户补资料，单独保留随机核查</w:t>
             </w:r>
           </w:p>
         </w:tc>
@@ -2725,7 +2852,7 @@
                 <w:b w:val="0"/>
                 <w:sz w:val="21"/>
               </w:rPr>
-              <w:t>经营画像</w:t>
+              <w:t>可信度</w:t>
             </w:r>
           </w:p>
         </w:tc>
@@ -2743,7 +2870,7 @@
                 <w:b w:val="0"/>
                 <w:sz w:val="21"/>
               </w:rPr>
-              <w:t>评分变化、活跃度、低分主题</w:t>
+              <w:t>12项指标；主题及概率未充分验证</w:t>
             </w:r>
           </w:p>
         </w:tc>
@@ -2761,7 +2888,7 @@
                 <w:b w:val="0"/>
                 <w:sz w:val="21"/>
               </w:rPr>
-              <w:t>核实具体经营问题，查看实际流水</w:t>
+              <w:t>展示指标和来源，不显示违约概率</w:t>
             </w:r>
           </w:p>
         </w:tc>
@@ -2781,7 +2908,7 @@
                 <w:b w:val="0"/>
                 <w:sz w:val="21"/>
               </w:rPr>
-              <w:t>调查排序</w:t>
+              <w:t>人工调查</w:t>
             </w:r>
           </w:p>
         </w:tc>
@@ -2799,7 +2926,7 @@
                 <w:b w:val="0"/>
                 <w:sz w:val="21"/>
               </w:rPr>
-              <w:t>预算对应的待复核名单及原因</w:t>
+              <w:t>主模型未优于低评分复核名单</w:t>
             </w:r>
           </w:p>
         </w:tc>
@@ -2817,7 +2944,7 @@
                 <w:b w:val="0"/>
                 <w:sz w:val="21"/>
               </w:rPr>
-              <w:t>人工确认营业情况，记录误报与漏报</w:t>
+              <w:t>仅作试点线索；核实流水与经营状态</w:t>
             </w:r>
           </w:p>
         </w:tc>
@@ -2837,7 +2964,7 @@
                 <w:b w:val="0"/>
                 <w:sz w:val="21"/>
               </w:rPr>
-              <w:t>反馈与验证</w:t>
+              <w:t>反馈验收</w:t>
             </w:r>
           </w:p>
         </w:tc>
@@ -2855,7 +2982,7 @@
                 <w:b w:val="0"/>
                 <w:sz w:val="21"/>
               </w:rPr>
-              <w:t>真实调查结果、成本与后续表现</w:t>
+              <w:t>目前无未来标签及真实成本</w:t>
             </w:r>
           </w:p>
         </w:tc>
@@ -2873,7 +3000,7 @@
                 <w:b w:val="0"/>
                 <w:sz w:val="21"/>
               </w:rPr>
-              <w:t>定期复验，检验增量及商业价值</w:t>
+              <w:t>记录确认结果、耗时、处置及后续表现</w:t>
             </w:r>
           </w:p>
         </w:tc>
@@ -2900,7 +3027,7 @@
         <w:jc w:val="both"/>
       </w:pPr>
       <w:r>
-        <w:t>第一，公开评论可以构建三维12项可解释的经营画像，便于在信息稀疏条件下形成调查线索。第二，本次主分析方案没有显示稳定的增量识别价值；增强树模型的探索性点估计较好，但模型差异和复核提升区间仍包含无改善，不能据此证明已具备金融风控能力。第三，日期混杂、标签缺失和历史地域限制决定了研究更适合可行性检验，尚不能支持自动授信或前瞻预警。</w:t>
+        <w:t>本研究形成三维12项画像，但没有证明稳定的排序增量或概率评分优势。核心业务结论是：先按可观测性分流，再按预算检验排序，最后以未来标签和净价值验收。仅49.52%的商户满足指标门槛，未覆盖组停业比例更高，故低数据覆盖不能被误当成低风险。增强树的高点估计未通过日期审计；当前建议保留画像与人工调查，不部署自动风险决策。</w:t>
       </w:r>
     </w:p>
     <w:p>
@@ -2908,7 +3035,7 @@
         <w:jc w:val="both"/>
       </w:pPr>
       <w:r>
-        <w:t>下一阶段采用统一月末观察点和之后90天经营核实标签；真实逾期单独验证。预先锁定流水基线、流水＋公开指标、10%复核预算及成本口径，保留后续月份与新地区测试。试点保留随机抽查组，复核人员先独立确认再查看模型原因。仅在增量置信区间下界&gt;0且净价值&gt;0时扩大使用，否则维持画像展示和人工调查。此为待执行方案，不是已完成实验。</w:t>
+        <w:t>下一阶段在已获许可前提下，以统一月末为观察点，之后90天独立核实停业、搬迁及经营困难；逾期另设信用标签。训练标签须在测试观察日前成熟，未知／失访不得记为正常。锁定流水基线与流水＋公开指标、10%预算和成本口径；留出后续月份／新地区，未覆盖商户也进入随机核查。只核查模型名单无法估计全量漏报，须借助独立标签或已知抽样概率的对照。记录有效发现、误报、漏报、耗时及干预；每月监测覆盖率和指标分布。增量区间下界&gt;0且净价值&gt;0才扩大，否则退回人工补资料。以上是待执行方案。</w:t>
       </w:r>
     </w:p>
     <w:p>

</xml_diff>